<commit_message>
Build-it-yourself scripts for every experiment (diy folder) and the guide sections that teach them
</commit_message>
<xml_diff>
--- a/reports/guide/Project_Explained_and_Verification_Guide.docx
+++ b/reports/guide/Project_Explained_and_Verification_Guide.docx
@@ -7332,7 +7332,7 @@
         <w:rPr>
           <w:sz w:val="21"/>
         </w:rPr>
-        <w:t>A: Its AI kept choosing one kind of example and never tried the best design. Six of the 12 designs score within 6 points of the best, so random picks usually include a good one. The improved agent fixes this with a better search structure, using the same model.</w:t>
+        <w:t>A: Its AI kept choosing one kind of example and never tried the best design. On P1, 5 of the 12 designs score within 6 points of the best, so 4 random picks usually include a good one. The improved agent fixes this with a better search structure, using the same model.</w:t>
       </w:r>
     </w:p>
     <w:p>
@@ -7791,7 +7791,7 @@
               <w:rPr>
                 <w:sz w:val="19"/>
               </w:rPr>
-              <w:t>runs\ (66 folders)</w:t>
+              <w:t>runs\ (70 folders)</w:t>
             </w:r>
           </w:p>
         </w:tc>

</xml_diff>